<commit_message>
Update Matthew's script in Presentation Planning to match current slides
Slide 8 dropped the ball-bearing vs stinger comparison in favor of a
single system slide; slide 12 now has 4 steps targeting late September
instead of 5 steps targeting October. Synced script content/talking
points to match.

Co-Authored-By: Claude Sonnet 5 <noreply@anthropic.com>
</commit_message>
<xml_diff>
--- a/Presentation Planning/Presentation Planning.docx
+++ b/Presentation Planning/Presentation Planning.docx
@@ -1122,24 +1122,41 @@
           <w:i w:val="false"/>
           <w:iCs w:val="false"/>
         </w:rPr>
-        <w:t xml:space="preserve">Key point: radial and axial measurement must not interfere with each other</w:t>
-      </w:r>
-    </w:p>
-    <w:p>
-      <w:pPr>
-        <w:pStyle w:val="ListParagraph"/>
-        <w:numPr>
-          <w:ilvl w:val="0"/>
-          <w:numId w:val="2"/>
-        </w:numPr>
-        <w:spacing w:after="40"/>
-      </w:pPr>
-      <w:r>
-        <w:rPr>
-          <w:i w:val="false"/>
-          <w:iCs w:val="false"/>
-        </w:rPr>
-        <w:t xml:space="preserve">“Stinger solves this — stiff in one direction, compliant in the other”</w:t>
+        <w:t xml:space="preserve">Constraint: each sensor can only respond to forces along its own axis</w:t>
+      </w:r>
+    </w:p>
+    <w:p>
+      <w:pPr>
+        <w:pStyle w:val="ListParagraph"/>
+        <w:numPr>
+          <w:ilvl w:val="0"/>
+          <w:numId w:val="2"/>
+        </w:numPr>
+        <w:spacing w:after="40"/>
+      </w:pPr>
+      <w:r>
+        <w:rPr>
+          <w:i w:val="false"/>
+          <w:iCs w:val="false"/>
+        </w:rPr>
+        <w:t xml:space="preserve">Issue: off-axis force escapes through the rigid structure instead of reaching its sensor, causing under-reporting</w:t>
+      </w:r>
+    </w:p>
+    <w:p>
+      <w:pPr>
+        <w:pStyle w:val="ListParagraph"/>
+        <w:numPr>
+          <w:ilvl w:val="0"/>
+          <w:numId w:val="2"/>
+        </w:numPr>
+        <w:spacing w:after="40"/>
+      </w:pPr>
+      <w:r>
+        <w:rPr>
+          <w:i w:val="false"/>
+          <w:iCs w:val="false"/>
+        </w:rPr>
+        <w:t xml:space="preserve">Solution: a load path that decouples each axis from the others</w:t>
       </w:r>
     </w:p>
     <w:p>
@@ -1170,7 +1187,7 @@
           <w:i w:val="false"/>
           <w:iCs w:val="false"/>
         </w:rPr>
-        <w:t xml:space="preserve">Explain physically why cross-talk matters: if radial load bleeds into the axial channel, imbalance measurements get corrupted</w:t>
+        <w:t xml:space="preserve">Explain physically why cross-talk matters: if radial load bleeds into the axial channel, imbalance measurements get corrupted (under-reported)</w:t>
       </w:r>
     </w:p>
     <w:p>
@@ -1216,7 +1233,7 @@
         <w:rPr>
           <w:color w:val="1F3864"/>
         </w:rPr>
-        <w:t xml:space="preserve">Slide 8 — Two Concepts: Ball Bearing and Stinger (1 min)</w:t>
+        <w:t xml:space="preserve">Slide 8 — Proposed Stinger Decoupling System (1 min)</w:t>
       </w:r>
     </w:p>
     <w:p>
@@ -1247,41 +1264,41 @@
           <w:i w:val="false"/>
           <w:iCs w:val="false"/>
         </w:rPr>
-        <w:t xml:space="preserve">Side by side: ball bearing plate sketch on left, stinger CAD on right</w:t>
-      </w:r>
-    </w:p>
-    <w:p>
-      <w:pPr>
-        <w:pStyle w:val="ListParagraph"/>
-        <w:numPr>
-          <w:ilvl w:val="0"/>
-          <w:numId w:val="2"/>
-        </w:numPr>
-        <w:spacing w:after="40"/>
-      </w:pPr>
-      <w:r>
-        <w:rPr>
-          <w:i w:val="false"/>
-          <w:iCs w:val="false"/>
-        </w:rPr>
-        <w:t xml:space="preserve">Two or three bullet points per concept</w:t>
-      </w:r>
-    </w:p>
-    <w:p>
-      <w:pPr>
-        <w:pStyle w:val="ListParagraph"/>
-        <w:numPr>
-          <w:ilvl w:val="0"/>
-          <w:numId w:val="2"/>
-        </w:numPr>
-        <w:spacing w:after="40"/>
-      </w:pPr>
-      <w:r>
-        <w:rPr>
-          <w:i w:val="false"/>
-          <w:iCs w:val="false"/>
-        </w:rPr>
-        <w:t xml:space="preserve">Highlight why stinger was chosen — no preload, clean load path, six components</w:t>
+        <w:t xml:space="preserve">CAD renders of the full stinger decoupling assembly</w:t>
+      </w:r>
+    </w:p>
+    <w:p>
+      <w:pPr>
+        <w:pStyle w:val="ListParagraph"/>
+        <w:numPr>
+          <w:ilvl w:val="0"/>
+          <w:numId w:val="2"/>
+        </w:numPr>
+        <w:spacing w:after="40"/>
+      </w:pPr>
+      <w:r>
+        <w:rPr>
+          <w:i w:val="false"/>
+          <w:iCs w:val="false"/>
+        </w:rPr>
+        <w:t xml:space="preserve">Six stingers + six force transducers, mounting plate for the RWA, heavy base to reduce background noise, support brackets for the radial sensors</w:t>
+      </w:r>
+    </w:p>
+    <w:p>
+      <w:pPr>
+        <w:pStyle w:val="ListParagraph"/>
+        <w:numPr>
+          <w:ilvl w:val="0"/>
+          <w:numId w:val="2"/>
+        </w:numPr>
+        <w:spacing w:after="40"/>
+      </w:pPr>
+      <w:r>
+        <w:rPr>
+          <w:i w:val="false"/>
+          <w:iCs w:val="false"/>
+        </w:rPr>
+        <w:t xml:space="preserve">Highlight: clean single load path for each force, resonant frequency considered in the design</w:t>
       </w:r>
     </w:p>
     <w:p>
@@ -1312,24 +1329,41 @@
           <w:i w:val="false"/>
           <w:iCs w:val="false"/>
         </w:rPr>
-        <w:t xml:space="preserve">Ball bearing plate needed preload to stay seated — an extra failure mode and extra complexity</w:t>
-      </w:r>
-    </w:p>
-    <w:p>
-      <w:pPr>
-        <w:pStyle w:val="ListParagraph"/>
-        <w:numPr>
-          <w:ilvl w:val="0"/>
-          <w:numId w:val="2"/>
-        </w:numPr>
-        <w:spacing w:after="40"/>
-      </w:pPr>
-      <w:r>
-        <w:rPr>
-          <w:i w:val="false"/>
-          <w:iCs w:val="false"/>
-        </w:rPr>
-        <w:t xml:space="preserve">Stinger needs no pretensioning, gives a clean single load path, and only six components to manufacture and align</w:t>
+        <w:t xml:space="preserve">Six stingers and six force transducers form the sensing core — one clean load path per measured force, decoupled from the others</w:t>
+      </w:r>
+    </w:p>
+    <w:p>
+      <w:pPr>
+        <w:pStyle w:val="ListParagraph"/>
+        <w:numPr>
+          <w:ilvl w:val="0"/>
+          <w:numId w:val="2"/>
+        </w:numPr>
+        <w:spacing w:after="40"/>
+      </w:pPr>
+      <w:r>
+        <w:rPr>
+          <w:i w:val="false"/>
+          <w:iCs w:val="false"/>
+        </w:rPr>
+        <w:t xml:space="preserve">Heavy base plate reduces background noise reaching the sensors; support brackets keep the radial sensors aligned to their axis</w:t>
+      </w:r>
+    </w:p>
+    <w:p>
+      <w:pPr>
+        <w:pStyle w:val="ListParagraph"/>
+        <w:numPr>
+          <w:ilvl w:val="0"/>
+          <w:numId w:val="2"/>
+        </w:numPr>
+        <w:spacing w:after="40"/>
+      </w:pPr>
+      <w:r>
+        <w:rPr>
+          <w:i w:val="false"/>
+          <w:iCs w:val="false"/>
+        </w:rPr>
+        <w:t xml:space="preserve">The assembly's resonant frequency matters as much as each stinger's own — sets up the FEA slide next</w:t>
       </w:r>
     </w:p>
     <w:p>
@@ -1389,7 +1423,7 @@
           <w:i w:val="false"/>
           <w:iCs w:val="false"/>
         </w:rPr>
-        <w:t xml:space="preserve">One diagram showing stinger with d and L labelled</w:t>
+        <w:t xml:space="preserve">One diagram showing stinger with D and L labelled</w:t>
       </w:r>
     </w:p>
     <w:p>
@@ -1423,7 +1457,7 @@
           <w:i w:val="false"/>
           <w:iCs w:val="false"/>
         </w:rPr>
-        <w:t xml:space="preserve">Results table with checkmarks</w:t>
+        <w:t xml:space="preserve">Results table with target, axial, and radial columns and checkmarks per check</w:t>
       </w:r>
     </w:p>
     <w:p>
@@ -1454,7 +1488,7 @@
           <w:i w:val="false"/>
           <w:iCs w:val="false"/>
         </w:rPr>
-        <w:t xml:space="preserve">Say plainly: four checks per stinger, all four passed for the selected geometry (d = 2 mm, L = 50 mm, steel)</w:t>
+        <w:t xml:space="preserve">Say plainly: four checks per stinger, all four passed for the selected geometry (D = 2 mm, L = 50 mm, steel)</w:t>
       </w:r>
     </w:p>
     <w:p>
@@ -1741,7 +1775,7 @@
           <w:i w:val="false"/>
           <w:iCs w:val="false"/>
         </w:rPr>
-        <w:t xml:space="preserve">Simple table: 3× S-beam strain gauge (axial) / 3× PCB 208C01 ICP (radial)</w:t>
+        <w:t xml:space="preserve">Simple table: S-beam strain gauge (axial role) / PCB 208C01 ICP (radial role)</w:t>
       </w:r>
     </w:p>
     <w:p>
@@ -1883,24 +1917,41 @@
           <w:i w:val="false"/>
           <w:iCs w:val="false"/>
         </w:rPr>
-        <w:t xml:space="preserve">Simple timeline or mini Gantt — not a bullet list</w:t>
-      </w:r>
-    </w:p>
-    <w:p>
-      <w:pPr>
-        <w:pStyle w:val="ListParagraph"/>
-        <w:numPr>
-          <w:ilvl w:val="0"/>
-          <w:numId w:val="2"/>
-        </w:numPr>
-        <w:spacing w:after="40"/>
-      </w:pPr>
-      <w:r>
-        <w:rPr>
-          <w:i w:val="false"/>
-          <w:iCs w:val="false"/>
-        </w:rPr>
-        <w:t xml:space="preserve">Five items: sensor procurement → fabrication → assembly → testing → validation</w:t>
+        <w:t xml:space="preserve">Simple four-step timeline — not a bullet list</w:t>
+      </w:r>
+    </w:p>
+    <w:p>
+      <w:pPr>
+        <w:pStyle w:val="ListParagraph"/>
+        <w:numPr>
+          <w:ilvl w:val="0"/>
+          <w:numId w:val="2"/>
+        </w:numPr>
+        <w:spacing w:after="40"/>
+      </w:pPr>
+      <w:r>
+        <w:rPr>
+          <w:i w:val="false"/>
+          <w:iCs w:val="false"/>
+        </w:rPr>
+        <w:t xml:space="preserve">Four items: detailed design → DAQ system → fabrication → experimental validation</w:t>
+      </w:r>
+    </w:p>
+    <w:p>
+      <w:pPr>
+        <w:pStyle w:val="ListParagraph"/>
+        <w:numPr>
+          <w:ilvl w:val="0"/>
+          <w:numId w:val="2"/>
+        </w:numPr>
+        <w:spacing w:after="40"/>
+      </w:pPr>
+      <w:r>
+        <w:rPr>
+          <w:i w:val="false"/>
+          <w:iCs w:val="false"/>
+        </w:rPr>
+        <w:t xml:space="preserve">Target: working proof of concept by late September</w:t>
       </w:r>
     </w:p>
     <w:p>
@@ -1948,41 +1999,41 @@
           <w:i w:val="false"/>
           <w:iCs w:val="false"/>
         </w:rPr>
-        <w:t xml:space="preserve">Walk through the five-step path: sensor procurement → static FEA → detailed design → fabrication → validation</w:t>
-      </w:r>
-    </w:p>
-    <w:p>
-      <w:pPr>
-        <w:pStyle w:val="ListParagraph"/>
-        <w:numPr>
-          <w:ilvl w:val="0"/>
-          <w:numId w:val="2"/>
-        </w:numPr>
-        <w:spacing w:after="40"/>
-      </w:pPr>
-      <w:r>
-        <w:rPr>
-          <w:i w:val="false"/>
-          <w:iCs w:val="false"/>
-        </w:rPr>
-        <w:t xml:space="preserve">Say the key dates out loud briefly — don't just point at the Gantt and move on</w:t>
-      </w:r>
-    </w:p>
-    <w:p>
-      <w:pPr>
-        <w:pStyle w:val="ListParagraph"/>
-        <w:numPr>
-          <w:ilvl w:val="0"/>
-          <w:numId w:val="2"/>
-        </w:numPr>
-        <w:spacing w:after="40"/>
-      </w:pPr>
-      <w:r>
-        <w:rPr>
-          <w:i w:val="false"/>
-          <w:iCs w:val="false"/>
-        </w:rPr>
-        <w:t xml:space="preserve">End confidently: “by October we will have a working proof of concept”</w:t>
+        <w:t xml:space="preserve">Walk through the four-step path: detailed design → DAQ system → fabrication → experimental validation</w:t>
+      </w:r>
+    </w:p>
+    <w:p>
+      <w:pPr>
+        <w:pStyle w:val="ListParagraph"/>
+        <w:numPr>
+          <w:ilvl w:val="0"/>
+          <w:numId w:val="2"/>
+        </w:numPr>
+        <w:spacing w:after="40"/>
+      </w:pPr>
+      <w:r>
+        <w:rPr>
+          <w:i w:val="false"/>
+          <w:iCs w:val="false"/>
+        </w:rPr>
+        <w:t xml:space="preserve">Say the key dates out loud briefly — don't just point at the timeline and move on</w:t>
+      </w:r>
+    </w:p>
+    <w:p>
+      <w:pPr>
+        <w:pStyle w:val="ListParagraph"/>
+        <w:numPr>
+          <w:ilvl w:val="0"/>
+          <w:numId w:val="2"/>
+        </w:numPr>
+        <w:spacing w:after="40"/>
+      </w:pPr>
+      <w:r>
+        <w:rPr>
+          <w:i w:val="false"/>
+          <w:iCs w:val="false"/>
+        </w:rPr>
+        <w:t xml:space="preserve">End confidently: “by late September we will have a working proof of concept”</w:t>
       </w:r>
     </w:p>
     <w:sectPr>

</xml_diff>